<commit_message>
Add editable template (Word/PPT) + lock core design assumption
- docs/Sample_Input_Checklist.docx/.pptx: 可编辑样本输入清单（空白模板+情境领导示范）
- docs/Core_Design_Assumption.{html,docx}: 核心设计假设（锁定）——远场景默认+强制应用迁移桥
- skill: 新增第7心法/核心假设段/应用迁移桥红线；validation_rules 增 VR-RE05(BLOCKER, 38条)
- PRD(html/docx) 注入核心假设加注段；Capability_Assets 重渲染同步
- scripts/: 单源生成器纳入仓库（gen_template/gen_core_assumption/render_assets/inject_prd）
- README 更新结构与版本
</commit_message>
<xml_diff>
--- a/docs/PRD.docx
+++ b/docs/PRD.docx
@@ -7157,6 +7157,69 @@
         <w:t>校验触发点：① 每阶段生成后（限权 Agent 产出即校验，不达标打回）；② 设计期预览/试玩后（Game Tester + AI 分析）；③ 导出离线包前（VR-OFF* 全过方可导出）。规则引用的扩展节点子 Schema 见 PRD 第 5 节注释与 `validation_rules.json`。</w:t>
       </w:r>
     </w:p>
+    <w:p>
+      <w:pPr>
+        <w:pStyle w:val="Heading1"/>
+      </w:pPr>
+      <w:r>
+        <w:rPr>
+          <w:rFonts w:ascii="Microsoft YaHei" w:hAnsi="Microsoft YaHei" w:eastAsia="Microsoft YaHei"/>
+        </w:rPr>
+        <w:t>核心设计假设（锁定 · 不可动摇）</w:t>
+      </w:r>
+    </w:p>
+    <w:p>
+      <w:r>
+        <w:rPr>
+          <w:rFonts w:ascii="Microsoft YaHei" w:hAnsi="Microsoft YaHei" w:eastAsia="Microsoft YaHei"/>
+        </w:rPr>
+        <w:t>AVG 的探索世界默认采用「远」（虚构类比）情景，作为心理安全的练习场；学员在虚构中体验/试错、沉淀方法论与工具，复盘后必须强制「应用迁移桥」——把所学迁移到学员自身真实工作场景。无论近/远，没有这条，学习与产品不成立。</w:t>
+      </w:r>
+    </w:p>
+    <w:p>
+      <w:pPr>
+        <w:pStyle w:val="ListBullet"/>
+      </w:pPr>
+      <w:r>
+        <w:rPr>
+          <w:rFonts w:ascii="Microsoft YaHei" w:hAnsi="Microsoft YaHei" w:eastAsia="Microsoft YaHei"/>
+        </w:rPr>
+        <w:t>远（默认）：星际探索/古堡谜案等类比世界，用距离降低 ego 威胁、提升试错与抽象能力。</w:t>
+      </w:r>
+    </w:p>
+    <w:p>
+      <w:pPr>
+        <w:pStyle w:val="ListBullet"/>
+      </w:pPr>
+      <w:r>
+        <w:rPr>
+          <w:rFonts w:ascii="Microsoft YaHei" w:hAnsi="Microsoft YaHei" w:eastAsia="Microsoft YaHei"/>
+        </w:rPr>
+        <w:t>近（可选）：仿真真实工作现场；仅在客户强合规/强真实诉求时选用，但应用迁移桥不可省。</w:t>
+      </w:r>
+    </w:p>
+    <w:p>
+      <w:pPr>
+        <w:pStyle w:val="ListBullet"/>
+      </w:pPr>
+      <w:r>
+        <w:rPr>
+          <w:rFonts w:ascii="Microsoft YaHei" w:hAnsi="Microsoft YaHei" w:eastAsia="Microsoft YaHei"/>
+        </w:rPr>
+        <w:t>应用迁移桥（强制）：真实挑战 + 选用方法 + 有时限第一步 → 离线包内嵌「真实场景应用卡」。</w:t>
+      </w:r>
+    </w:p>
+    <w:p>
+      <w:pPr>
+        <w:pStyle w:val="ListBullet"/>
+      </w:pPr>
+      <w:r>
+        <w:rPr>
+          <w:rFonts w:ascii="Microsoft YaHei" w:hAnsi="Microsoft YaHei" w:eastAsia="Microsoft YaHei"/>
+        </w:rPr>
+        <w:t>校验：新增 VR-RE05（BLOCKER），缺桥不得发布。详见 Core_Design_Assumption.docx。</w:t>
+      </w:r>
+    </w:p>
     <w:sectPr>
       <w:pgSz w:w="12240" w:h="15840"/>
       <w:pgMar w:top="1440" w:right="1800" w:bottom="1440" w:left="1800" w:header="720" w:footer="720" w:gutter="0"/>

</xml_diff>